<commit_message>
Cambios del diagrama y README
</commit_message>
<xml_diff>
--- a/docs/guia_materiales_taller3.docx
+++ b/docs/guia_materiales_taller3.docx
@@ -85,7 +85,49 @@
         <w:rPr>
           <w:color w:val="000000"/>
         </w:rPr>
-        <w:t>Este documento describe los materiales del Taller 3 del curso, centrado en el diseño e implementación de la tarea N-Back en PsychoPy Builder. La tarea sigue el paradigma N-back introducido por Kirchner (1958), e incluye tres niveles (1-back, 2-back y 3-back) con secuencias de letras pre-generadas. Huang et al. (2025) es la revisión de referencia utilizada en el taller.</w:t>
+        <w:t xml:space="preserve">Este documento describe los materiales del Taller 3 del curso, centrado en el diseño e implementación de la tarea N-Back en </w:t>
+      </w:r>
+      <w:proofErr w:type="spellStart"/>
+      <w:r>
+        <w:rPr>
+          <w:color w:val="000000"/>
+        </w:rPr>
+        <w:t>PsychoPy</w:t>
+      </w:r>
+      <w:proofErr w:type="spellEnd"/>
+      <w:r>
+        <w:rPr>
+          <w:color w:val="000000"/>
+        </w:rPr>
+        <w:t xml:space="preserve"> </w:t>
+      </w:r>
+      <w:proofErr w:type="spellStart"/>
+      <w:r>
+        <w:rPr>
+          <w:color w:val="000000"/>
+        </w:rPr>
+        <w:t>Builder</w:t>
+      </w:r>
+      <w:proofErr w:type="spellEnd"/>
+      <w:r>
+        <w:rPr>
+          <w:color w:val="000000"/>
+        </w:rPr>
+        <w:t xml:space="preserve">. La tarea sigue el paradigma N-back introducido por Kirchner (1958), e incluye tres niveles (1-back, 2-back y 3-back) con secuencias de letras </w:t>
+      </w:r>
+      <w:proofErr w:type="spellStart"/>
+      <w:r>
+        <w:rPr>
+          <w:color w:val="000000"/>
+        </w:rPr>
+        <w:t>pre-generadas</w:t>
+      </w:r>
+      <w:proofErr w:type="spellEnd"/>
+      <w:r>
+        <w:rPr>
+          <w:color w:val="000000"/>
+        </w:rPr>
+        <w:t>. Huang et al. (2025) es la revisión de referencia utilizada en el taller.</w:t>
       </w:r>
     </w:p>
     <w:p>
@@ -159,7 +201,21 @@
           <w:color w:val="000000"/>
         </w:rPr>
         <w:tab/>
-        <w:t>Seleccionar Download ZIP.</w:t>
+        <w:t xml:space="preserve">Seleccionar </w:t>
+      </w:r>
+      <w:proofErr w:type="spellStart"/>
+      <w:r>
+        <w:rPr>
+          <w:color w:val="000000"/>
+        </w:rPr>
+        <w:t>Download</w:t>
+      </w:r>
+      <w:proofErr w:type="spellEnd"/>
+      <w:r>
+        <w:rPr>
+          <w:color w:val="000000"/>
+        </w:rPr>
+        <w:t xml:space="preserve"> ZIP.</w:t>
       </w:r>
     </w:p>
     <w:p>
@@ -199,7 +255,57 @@
           <w:color w:val="000000"/>
         </w:rPr>
         <w:tab/>
-        <w:t>Abrir PsychoPy Builder y cargar el archivo nBack_task.psyexp.</w:t>
+        <w:t xml:space="preserve">Abrir </w:t>
+      </w:r>
+      <w:proofErr w:type="spellStart"/>
+      <w:r>
+        <w:rPr>
+          <w:color w:val="000000"/>
+        </w:rPr>
+        <w:t>PsychoPy</w:t>
+      </w:r>
+      <w:proofErr w:type="spellEnd"/>
+      <w:r>
+        <w:rPr>
+          <w:color w:val="000000"/>
+        </w:rPr>
+        <w:t xml:space="preserve"> </w:t>
+      </w:r>
+      <w:proofErr w:type="spellStart"/>
+      <w:r>
+        <w:rPr>
+          <w:color w:val="000000"/>
+        </w:rPr>
+        <w:t>Builder</w:t>
+      </w:r>
+      <w:proofErr w:type="spellEnd"/>
+      <w:r>
+        <w:rPr>
+          <w:color w:val="000000"/>
+        </w:rPr>
+        <w:t xml:space="preserve"> y cargar el archivo </w:t>
+      </w:r>
+      <w:proofErr w:type="spellStart"/>
+      <w:r>
+        <w:rPr>
+          <w:color w:val="000000"/>
+        </w:rPr>
+        <w:t>nBack_</w:t>
+      </w:r>
+      <w:proofErr w:type="gramStart"/>
+      <w:r>
+        <w:rPr>
+          <w:color w:val="000000"/>
+        </w:rPr>
+        <w:t>task.psyexp</w:t>
+      </w:r>
+      <w:proofErr w:type="spellEnd"/>
+      <w:proofErr w:type="gramEnd"/>
+      <w:r>
+        <w:rPr>
+          <w:color w:val="000000"/>
+        </w:rPr>
+        <w:t>.</w:t>
       </w:r>
     </w:p>
     <w:p>
@@ -267,7 +373,25 @@
                 <w:sz w:val="22"/>
                 <w:szCs w:val="22"/>
               </w:rPr>
-              <w:t>No mover ni renombrar ninguna carpeta. PsychoPy necesita encontrar los archivos exactamente en las rutas que se configurarán durante el taller.</w:t>
+              <w:t xml:space="preserve">No mover ni renombrar ninguna carpeta. </w:t>
+            </w:r>
+            <w:proofErr w:type="spellStart"/>
+            <w:r>
+              <w:rPr>
+                <w:color w:val="000000"/>
+                <w:sz w:val="22"/>
+                <w:szCs w:val="22"/>
+              </w:rPr>
+              <w:t>PsychoPy</w:t>
+            </w:r>
+            <w:proofErr w:type="spellEnd"/>
+            <w:r>
+              <w:rPr>
+                <w:color w:val="000000"/>
+                <w:sz w:val="22"/>
+                <w:szCs w:val="22"/>
+              </w:rPr>
+              <w:t xml:space="preserve"> necesita encontrar los archivos exactamente en las rutas que se configurarán durante el taller.</w:t>
             </w:r>
           </w:p>
         </w:tc>
@@ -389,8 +513,32 @@
                 <w:szCs w:val="20"/>
                 <w:lang w:val="en-US"/>
               </w:rPr>
-              <w:t>├── nBack_task.psyexp</w:t>
-            </w:r>
+              <w:t xml:space="preserve">├── </w:t>
+            </w:r>
+            <w:proofErr w:type="spellStart"/>
+            <w:r>
+              <w:rPr>
+                <w:rFonts w:ascii="Courier New" w:eastAsia="Courier New" w:hAnsi="Courier New" w:cs="Courier New"/>
+                <w:color w:val="000000"/>
+                <w:sz w:val="20"/>
+                <w:szCs w:val="20"/>
+                <w:lang w:val="en-US"/>
+              </w:rPr>
+              <w:t>nBack_</w:t>
+            </w:r>
+            <w:proofErr w:type="gramStart"/>
+            <w:r>
+              <w:rPr>
+                <w:rFonts w:ascii="Courier New" w:eastAsia="Courier New" w:hAnsi="Courier New" w:cs="Courier New"/>
+                <w:color w:val="000000"/>
+                <w:sz w:val="20"/>
+                <w:szCs w:val="20"/>
+                <w:lang w:val="en-US"/>
+              </w:rPr>
+              <w:t>task.psyexp</w:t>
+            </w:r>
+            <w:proofErr w:type="spellEnd"/>
+            <w:proofErr w:type="gramEnd"/>
           </w:p>
           <w:p>
             <w:pPr>
@@ -481,7 +629,29 @@
                 <w:szCs w:val="20"/>
                 <w:lang w:val="en-US"/>
               </w:rPr>
-              <w:t>experimental_1back.xlsx   (20 trials — 1-back experimental)</w:t>
+              <w:t>experimental_1back.xlsx</w:t>
+            </w:r>
+            <w:proofErr w:type="gramStart"/>
+            <w:r>
+              <w:rPr>
+                <w:rFonts w:ascii="Courier New" w:eastAsia="Courier New" w:hAnsi="Courier New" w:cs="Courier New"/>
+                <w:color w:val="000000"/>
+                <w:sz w:val="20"/>
+                <w:szCs w:val="20"/>
+                <w:lang w:val="en-US"/>
+              </w:rPr>
+              <w:t xml:space="preserve">   (</w:t>
+            </w:r>
+            <w:proofErr w:type="gramEnd"/>
+            <w:r>
+              <w:rPr>
+                <w:rFonts w:ascii="Courier New" w:eastAsia="Courier New" w:hAnsi="Courier New" w:cs="Courier New"/>
+                <w:color w:val="000000"/>
+                <w:sz w:val="20"/>
+                <w:szCs w:val="20"/>
+                <w:lang w:val="en-US"/>
+              </w:rPr>
+              <w:t>20 trials — 1-back experimental)</w:t>
             </w:r>
           </w:p>
           <w:p>
@@ -519,7 +689,29 @@
                 <w:szCs w:val="20"/>
                 <w:lang w:val="en-US"/>
               </w:rPr>
-              <w:t>experimental_2back.xlsx   (20 trials — 2-back experimental)</w:t>
+              <w:t>experimental_2back.xlsx</w:t>
+            </w:r>
+            <w:proofErr w:type="gramStart"/>
+            <w:r>
+              <w:rPr>
+                <w:rFonts w:ascii="Courier New" w:eastAsia="Courier New" w:hAnsi="Courier New" w:cs="Courier New"/>
+                <w:color w:val="000000"/>
+                <w:sz w:val="20"/>
+                <w:szCs w:val="20"/>
+                <w:lang w:val="en-US"/>
+              </w:rPr>
+              <w:t xml:space="preserve">   (</w:t>
+            </w:r>
+            <w:proofErr w:type="gramEnd"/>
+            <w:r>
+              <w:rPr>
+                <w:rFonts w:ascii="Courier New" w:eastAsia="Courier New" w:hAnsi="Courier New" w:cs="Courier New"/>
+                <w:color w:val="000000"/>
+                <w:sz w:val="20"/>
+                <w:szCs w:val="20"/>
+                <w:lang w:val="en-US"/>
+              </w:rPr>
+              <w:t>20 trials — 2-back experimental)</w:t>
             </w:r>
           </w:p>
           <w:p>
@@ -557,7 +749,29 @@
                 <w:szCs w:val="20"/>
                 <w:lang w:val="en-US"/>
               </w:rPr>
-              <w:t>experimental_3back.xlsx   (20 trials — 3-back experimental)</w:t>
+              <w:t>experimental_3back.xlsx</w:t>
+            </w:r>
+            <w:proofErr w:type="gramStart"/>
+            <w:r>
+              <w:rPr>
+                <w:rFonts w:ascii="Courier New" w:eastAsia="Courier New" w:hAnsi="Courier New" w:cs="Courier New"/>
+                <w:color w:val="000000"/>
+                <w:sz w:val="20"/>
+                <w:szCs w:val="20"/>
+                <w:lang w:val="en-US"/>
+              </w:rPr>
+              <w:t xml:space="preserve">   (</w:t>
+            </w:r>
+            <w:proofErr w:type="gramEnd"/>
+            <w:r>
+              <w:rPr>
+                <w:rFonts w:ascii="Courier New" w:eastAsia="Courier New" w:hAnsi="Courier New" w:cs="Courier New"/>
+                <w:color w:val="000000"/>
+                <w:sz w:val="20"/>
+                <w:szCs w:val="20"/>
+                <w:lang w:val="en-US"/>
+              </w:rPr>
+              <w:t>20 trials — 3-back experimental)</w:t>
             </w:r>
           </w:p>
           <w:p>
@@ -613,7 +827,51 @@
                 <w:szCs w:val="20"/>
                 <w:lang w:val="en-US"/>
               </w:rPr>
-              <w:t>practica_1back.xlsx        (8 trials — 1-back práctica)</w:t>
+              <w:t xml:space="preserve">practica_1back.xlsx     </w:t>
+            </w:r>
+            <w:proofErr w:type="gramStart"/>
+            <w:r>
+              <w:rPr>
+                <w:rFonts w:ascii="Courier New" w:eastAsia="Courier New" w:hAnsi="Courier New" w:cs="Courier New"/>
+                <w:color w:val="000000"/>
+                <w:sz w:val="20"/>
+                <w:szCs w:val="20"/>
+                <w:lang w:val="en-US"/>
+              </w:rPr>
+              <w:t xml:space="preserve">   (</w:t>
+            </w:r>
+            <w:proofErr w:type="gramEnd"/>
+            <w:r>
+              <w:rPr>
+                <w:rFonts w:ascii="Courier New" w:eastAsia="Courier New" w:hAnsi="Courier New" w:cs="Courier New"/>
+                <w:color w:val="000000"/>
+                <w:sz w:val="20"/>
+                <w:szCs w:val="20"/>
+                <w:lang w:val="en-US"/>
+              </w:rPr>
+              <w:t xml:space="preserve">8 trials — 1-back </w:t>
+            </w:r>
+            <w:proofErr w:type="spellStart"/>
+            <w:r>
+              <w:rPr>
+                <w:rFonts w:ascii="Courier New" w:eastAsia="Courier New" w:hAnsi="Courier New" w:cs="Courier New"/>
+                <w:color w:val="000000"/>
+                <w:sz w:val="20"/>
+                <w:szCs w:val="20"/>
+                <w:lang w:val="en-US"/>
+              </w:rPr>
+              <w:t>práctica</w:t>
+            </w:r>
+            <w:proofErr w:type="spellEnd"/>
+            <w:r>
+              <w:rPr>
+                <w:rFonts w:ascii="Courier New" w:eastAsia="Courier New" w:hAnsi="Courier New" w:cs="Courier New"/>
+                <w:color w:val="000000"/>
+                <w:sz w:val="20"/>
+                <w:szCs w:val="20"/>
+                <w:lang w:val="en-US"/>
+              </w:rPr>
+              <w:t>)</w:t>
             </w:r>
           </w:p>
           <w:p>
@@ -651,7 +909,51 @@
                 <w:szCs w:val="20"/>
                 <w:lang w:val="en-US"/>
               </w:rPr>
-              <w:t>practica_2back.xlsx        (8 trials — 2-back práctica)</w:t>
+              <w:t xml:space="preserve">practica_2back.xlsx     </w:t>
+            </w:r>
+            <w:proofErr w:type="gramStart"/>
+            <w:r>
+              <w:rPr>
+                <w:rFonts w:ascii="Courier New" w:eastAsia="Courier New" w:hAnsi="Courier New" w:cs="Courier New"/>
+                <w:color w:val="000000"/>
+                <w:sz w:val="20"/>
+                <w:szCs w:val="20"/>
+                <w:lang w:val="en-US"/>
+              </w:rPr>
+              <w:t xml:space="preserve">   (</w:t>
+            </w:r>
+            <w:proofErr w:type="gramEnd"/>
+            <w:r>
+              <w:rPr>
+                <w:rFonts w:ascii="Courier New" w:eastAsia="Courier New" w:hAnsi="Courier New" w:cs="Courier New"/>
+                <w:color w:val="000000"/>
+                <w:sz w:val="20"/>
+                <w:szCs w:val="20"/>
+                <w:lang w:val="en-US"/>
+              </w:rPr>
+              <w:t xml:space="preserve">8 trials — 2-back </w:t>
+            </w:r>
+            <w:proofErr w:type="spellStart"/>
+            <w:r>
+              <w:rPr>
+                <w:rFonts w:ascii="Courier New" w:eastAsia="Courier New" w:hAnsi="Courier New" w:cs="Courier New"/>
+                <w:color w:val="000000"/>
+                <w:sz w:val="20"/>
+                <w:szCs w:val="20"/>
+                <w:lang w:val="en-US"/>
+              </w:rPr>
+              <w:t>práctica</w:t>
+            </w:r>
+            <w:proofErr w:type="spellEnd"/>
+            <w:r>
+              <w:rPr>
+                <w:rFonts w:ascii="Courier New" w:eastAsia="Courier New" w:hAnsi="Courier New" w:cs="Courier New"/>
+                <w:color w:val="000000"/>
+                <w:sz w:val="20"/>
+                <w:szCs w:val="20"/>
+                <w:lang w:val="en-US"/>
+              </w:rPr>
+              <w:t>)</w:t>
             </w:r>
           </w:p>
           <w:p>
@@ -689,7 +991,51 @@
                 <w:szCs w:val="20"/>
                 <w:lang w:val="en-US"/>
               </w:rPr>
-              <w:t>practica_3back.xlsx        (8 trials — 3-back práctica)</w:t>
+              <w:t xml:space="preserve">practica_3back.xlsx     </w:t>
+            </w:r>
+            <w:proofErr w:type="gramStart"/>
+            <w:r>
+              <w:rPr>
+                <w:rFonts w:ascii="Courier New" w:eastAsia="Courier New" w:hAnsi="Courier New" w:cs="Courier New"/>
+                <w:color w:val="000000"/>
+                <w:sz w:val="20"/>
+                <w:szCs w:val="20"/>
+                <w:lang w:val="en-US"/>
+              </w:rPr>
+              <w:t xml:space="preserve">   (</w:t>
+            </w:r>
+            <w:proofErr w:type="gramEnd"/>
+            <w:r>
+              <w:rPr>
+                <w:rFonts w:ascii="Courier New" w:eastAsia="Courier New" w:hAnsi="Courier New" w:cs="Courier New"/>
+                <w:color w:val="000000"/>
+                <w:sz w:val="20"/>
+                <w:szCs w:val="20"/>
+                <w:lang w:val="en-US"/>
+              </w:rPr>
+              <w:t xml:space="preserve">8 trials — 3-back </w:t>
+            </w:r>
+            <w:proofErr w:type="spellStart"/>
+            <w:r>
+              <w:rPr>
+                <w:rFonts w:ascii="Courier New" w:eastAsia="Courier New" w:hAnsi="Courier New" w:cs="Courier New"/>
+                <w:color w:val="000000"/>
+                <w:sz w:val="20"/>
+                <w:szCs w:val="20"/>
+                <w:lang w:val="en-US"/>
+              </w:rPr>
+              <w:t>práctica</w:t>
+            </w:r>
+            <w:proofErr w:type="spellEnd"/>
+            <w:r>
+              <w:rPr>
+                <w:rFonts w:ascii="Courier New" w:eastAsia="Courier New" w:hAnsi="Courier New" w:cs="Courier New"/>
+                <w:color w:val="000000"/>
+                <w:sz w:val="20"/>
+                <w:szCs w:val="20"/>
+                <w:lang w:val="en-US"/>
+              </w:rPr>
+              <w:t>)</w:t>
             </w:r>
           </w:p>
           <w:p>
@@ -717,7 +1063,27 @@
                 <w:sz w:val="20"/>
                 <w:szCs w:val="20"/>
               </w:rPr>
-              <w:t>├── docs/</w:t>
+              <w:t xml:space="preserve">├── </w:t>
+            </w:r>
+            <w:proofErr w:type="spellStart"/>
+            <w:r>
+              <w:rPr>
+                <w:rFonts w:ascii="Courier New" w:eastAsia="Courier New" w:hAnsi="Courier New" w:cs="Courier New"/>
+                <w:color w:val="000000"/>
+                <w:sz w:val="20"/>
+                <w:szCs w:val="20"/>
+              </w:rPr>
+              <w:t>docs</w:t>
+            </w:r>
+            <w:proofErr w:type="spellEnd"/>
+            <w:r>
+              <w:rPr>
+                <w:rFonts w:ascii="Courier New" w:eastAsia="Courier New" w:hAnsi="Courier New" w:cs="Courier New"/>
+                <w:color w:val="000000"/>
+                <w:sz w:val="20"/>
+                <w:szCs w:val="20"/>
+              </w:rPr>
+              <w:t>/</w:t>
             </w:r>
           </w:p>
           <w:p>
@@ -1141,7 +1507,43 @@
                 <w:sz w:val="22"/>
                 <w:szCs w:val="22"/>
               </w:rPr>
-              <w:t>L (coincide — target)  ·  A (no coincide — non-target)</w:t>
+              <w:t xml:space="preserve">L (coincide — </w:t>
+            </w:r>
+            <w:proofErr w:type="gramStart"/>
+            <w:r>
+              <w:rPr>
+                <w:color w:val="000000"/>
+                <w:sz w:val="22"/>
+                <w:szCs w:val="22"/>
+              </w:rPr>
+              <w:t>target)  ·</w:t>
+            </w:r>
+            <w:proofErr w:type="gramEnd"/>
+            <w:r>
+              <w:rPr>
+                <w:color w:val="000000"/>
+                <w:sz w:val="22"/>
+                <w:szCs w:val="22"/>
+              </w:rPr>
+              <w:t xml:space="preserve">  A (no coincide — non-</w:t>
+            </w:r>
+            <w:proofErr w:type="gramStart"/>
+            <w:r>
+              <w:rPr>
+                <w:color w:val="000000"/>
+                <w:sz w:val="22"/>
+                <w:szCs w:val="22"/>
+              </w:rPr>
+              <w:t>target</w:t>
+            </w:r>
+            <w:proofErr w:type="gramEnd"/>
+            <w:r>
+              <w:rPr>
+                <w:color w:val="000000"/>
+                <w:sz w:val="22"/>
+                <w:szCs w:val="22"/>
+              </w:rPr>
+              <w:t>)</w:t>
             </w:r>
           </w:p>
         </w:tc>
@@ -1165,13 +1567,23 @@
             </w:tcMar>
           </w:tcPr>
           <w:p>
-            <w:r>
-              <w:rPr>
-                <w:color w:val="000000"/>
-                <w:sz w:val="22"/>
-                <w:szCs w:val="22"/>
-              </w:rPr>
-              <w:t>Trials de práctica</w:t>
+            <w:proofErr w:type="spellStart"/>
+            <w:r>
+              <w:rPr>
+                <w:color w:val="000000"/>
+                <w:sz w:val="22"/>
+                <w:szCs w:val="22"/>
+              </w:rPr>
+              <w:t>Trials</w:t>
+            </w:r>
+            <w:proofErr w:type="spellEnd"/>
+            <w:r>
+              <w:rPr>
+                <w:color w:val="000000"/>
+                <w:sz w:val="22"/>
+                <w:szCs w:val="22"/>
+              </w:rPr>
+              <w:t xml:space="preserve"> de práctica</w:t>
             </w:r>
           </w:p>
         </w:tc>
@@ -1205,7 +1617,47 @@
                 <w:szCs w:val="22"/>
                 <w:lang w:val="en-US"/>
               </w:rPr>
-              <w:t>8 por nivel (3 targets, 5 non-targets)</w:t>
+              <w:t xml:space="preserve">8 </w:t>
+            </w:r>
+            <w:proofErr w:type="spellStart"/>
+            <w:r>
+              <w:rPr>
+                <w:color w:val="000000"/>
+                <w:sz w:val="22"/>
+                <w:szCs w:val="22"/>
+                <w:lang w:val="en-US"/>
+              </w:rPr>
+              <w:t>por</w:t>
+            </w:r>
+            <w:proofErr w:type="spellEnd"/>
+            <w:r>
+              <w:rPr>
+                <w:color w:val="000000"/>
+                <w:sz w:val="22"/>
+                <w:szCs w:val="22"/>
+                <w:lang w:val="en-US"/>
+              </w:rPr>
+              <w:t xml:space="preserve"> </w:t>
+            </w:r>
+            <w:proofErr w:type="spellStart"/>
+            <w:r>
+              <w:rPr>
+                <w:color w:val="000000"/>
+                <w:sz w:val="22"/>
+                <w:szCs w:val="22"/>
+                <w:lang w:val="en-US"/>
+              </w:rPr>
+              <w:t>nivel</w:t>
+            </w:r>
+            <w:proofErr w:type="spellEnd"/>
+            <w:r>
+              <w:rPr>
+                <w:color w:val="000000"/>
+                <w:sz w:val="22"/>
+                <w:szCs w:val="22"/>
+                <w:lang w:val="en-US"/>
+              </w:rPr>
+              <w:t xml:space="preserve"> (3 targets, 5 non-targets)</w:t>
             </w:r>
           </w:p>
         </w:tc>
@@ -1229,13 +1681,23 @@
             </w:tcMar>
           </w:tcPr>
           <w:p>
-            <w:r>
-              <w:rPr>
-                <w:color w:val="000000"/>
-                <w:sz w:val="22"/>
-                <w:szCs w:val="22"/>
-              </w:rPr>
-              <w:t>Trials experimentales</w:t>
+            <w:proofErr w:type="spellStart"/>
+            <w:r>
+              <w:rPr>
+                <w:color w:val="000000"/>
+                <w:sz w:val="22"/>
+                <w:szCs w:val="22"/>
+              </w:rPr>
+              <w:t>Trials</w:t>
+            </w:r>
+            <w:proofErr w:type="spellEnd"/>
+            <w:r>
+              <w:rPr>
+                <w:color w:val="000000"/>
+                <w:sz w:val="22"/>
+                <w:szCs w:val="22"/>
+              </w:rPr>
+              <w:t xml:space="preserve"> experimentales</w:t>
             </w:r>
           </w:p>
         </w:tc>
@@ -1269,7 +1731,47 @@
                 <w:szCs w:val="22"/>
                 <w:lang w:val="en-US"/>
               </w:rPr>
-              <w:t>20 por nivel (6 targets, 14 non-targets — 30% targets)</w:t>
+              <w:t xml:space="preserve">20 </w:t>
+            </w:r>
+            <w:proofErr w:type="spellStart"/>
+            <w:r>
+              <w:rPr>
+                <w:color w:val="000000"/>
+                <w:sz w:val="22"/>
+                <w:szCs w:val="22"/>
+                <w:lang w:val="en-US"/>
+              </w:rPr>
+              <w:t>por</w:t>
+            </w:r>
+            <w:proofErr w:type="spellEnd"/>
+            <w:r>
+              <w:rPr>
+                <w:color w:val="000000"/>
+                <w:sz w:val="22"/>
+                <w:szCs w:val="22"/>
+                <w:lang w:val="en-US"/>
+              </w:rPr>
+              <w:t xml:space="preserve"> </w:t>
+            </w:r>
+            <w:proofErr w:type="spellStart"/>
+            <w:r>
+              <w:rPr>
+                <w:color w:val="000000"/>
+                <w:sz w:val="22"/>
+                <w:szCs w:val="22"/>
+                <w:lang w:val="en-US"/>
+              </w:rPr>
+              <w:t>nivel</w:t>
+            </w:r>
+            <w:proofErr w:type="spellEnd"/>
+            <w:r>
+              <w:rPr>
+                <w:color w:val="000000"/>
+                <w:sz w:val="22"/>
+                <w:szCs w:val="22"/>
+                <w:lang w:val="en-US"/>
+              </w:rPr>
+              <w:t xml:space="preserve"> (6 targets, 14 non-targets — 30% targets)</w:t>
             </w:r>
           </w:p>
         </w:tc>
@@ -1385,7 +1887,25 @@
                 <w:sz w:val="22"/>
                 <w:szCs w:val="22"/>
               </w:rPr>
-              <w:t>2000 ms (forceEndRoutine = True)</w:t>
+              <w:t>2000 ms (</w:t>
+            </w:r>
+            <w:proofErr w:type="spellStart"/>
+            <w:r>
+              <w:rPr>
+                <w:color w:val="000000"/>
+                <w:sz w:val="22"/>
+                <w:szCs w:val="22"/>
+              </w:rPr>
+              <w:t>forceEndRoutine</w:t>
+            </w:r>
+            <w:proofErr w:type="spellEnd"/>
+            <w:r>
+              <w:rPr>
+                <w:color w:val="000000"/>
+                <w:sz w:val="22"/>
+                <w:szCs w:val="22"/>
+              </w:rPr>
+              <w:t xml:space="preserve"> = True)</w:t>
             </w:r>
           </w:p>
         </w:tc>
@@ -1409,6 +1929,7 @@
             </w:tcMar>
           </w:tcPr>
           <w:p>
+            <w:proofErr w:type="spellStart"/>
             <w:r>
               <w:rPr>
                 <w:color w:val="000000"/>
@@ -1417,6 +1938,7 @@
               </w:rPr>
               <w:t>Feedback</w:t>
             </w:r>
+            <w:proofErr w:type="spellEnd"/>
           </w:p>
         </w:tc>
         <w:tc>
@@ -1536,22 +2058,76 @@
           <w:sz w:val="20"/>
           <w:szCs w:val="20"/>
         </w:rPr>
-        <w:t xml:space="preserve">El loop de cada bloque debe configurarse con loopType = sequential. No aleatorizar </w:t>
-      </w:r>
+        <w:t xml:space="preserve">El </w:t>
+      </w:r>
+      <w:proofErr w:type="spellStart"/>
       <w:r>
         <w:rPr>
           <w:color w:val="000000"/>
           <w:sz w:val="20"/>
           <w:szCs w:val="20"/>
         </w:rPr>
-        <w:t>-</w:t>
-      </w:r>
+        <w:t>loop</w:t>
+      </w:r>
+      <w:proofErr w:type="spellEnd"/>
       <w:r>
         <w:rPr>
           <w:color w:val="000000"/>
           <w:sz w:val="20"/>
           <w:szCs w:val="20"/>
         </w:rPr>
+        <w:t xml:space="preserve"> de cada bloque debe configurarse con </w:t>
+      </w:r>
+      <w:proofErr w:type="spellStart"/>
+      <w:r>
+        <w:rPr>
+          <w:color w:val="000000"/>
+          <w:sz w:val="20"/>
+          <w:szCs w:val="20"/>
+        </w:rPr>
+        <w:t>loopType</w:t>
+      </w:r>
+      <w:proofErr w:type="spellEnd"/>
+      <w:r>
+        <w:rPr>
+          <w:color w:val="000000"/>
+          <w:sz w:val="20"/>
+          <w:szCs w:val="20"/>
+        </w:rPr>
+        <w:t xml:space="preserve"> = </w:t>
+      </w:r>
+      <w:proofErr w:type="spellStart"/>
+      <w:r>
+        <w:rPr>
+          <w:color w:val="000000"/>
+          <w:sz w:val="20"/>
+          <w:szCs w:val="20"/>
+        </w:rPr>
+        <w:t>sequential</w:t>
+      </w:r>
+      <w:proofErr w:type="spellEnd"/>
+      <w:r>
+        <w:rPr>
+          <w:color w:val="000000"/>
+          <w:sz w:val="20"/>
+          <w:szCs w:val="20"/>
+        </w:rPr>
+        <w:t xml:space="preserve">. No aleatorizar </w:t>
+      </w:r>
+      <w:r>
+        <w:rPr>
+          <w:color w:val="000000"/>
+          <w:sz w:val="20"/>
+          <w:szCs w:val="20"/>
+        </w:rPr>
+        <w:t>-</w:t>
+      </w:r>
+      <w:r>
+        <w:rPr>
+          <w:color w:val="000000"/>
+          <w:sz w:val="20"/>
+          <w:szCs w:val="20"/>
+        </w:rPr>
         <w:t xml:space="preserve"> el orden de la secuencia es crítico para la lógica N-back.</w:t>
       </w:r>
     </w:p>
@@ -1593,7 +2169,25 @@
           <w:iCs/>
           <w:color w:val="000000"/>
         </w:rPr>
-        <w:t>Gráfico del flujo de routines de la tarea N-Back</w:t>
+        <w:t xml:space="preserve">Gráfico del flujo de </w:t>
+      </w:r>
+      <w:proofErr w:type="spellStart"/>
+      <w:r>
+        <w:rPr>
+          <w:i/>
+          <w:iCs/>
+          <w:color w:val="000000"/>
+        </w:rPr>
+        <w:t>routines</w:t>
+      </w:r>
+      <w:proofErr w:type="spellEnd"/>
+      <w:r>
+        <w:rPr>
+          <w:i/>
+          <w:iCs/>
+          <w:color w:val="000000"/>
+        </w:rPr>
+        <w:t xml:space="preserve"> de la tarea N-Back</w:t>
       </w:r>
     </w:p>
     <w:p>
@@ -1605,10 +2199,10 @@
           <w:noProof/>
         </w:rPr>
         <w:drawing>
-          <wp:inline distT="0" distB="0" distL="0" distR="0" wp14:anchorId="15ACFD0F" wp14:editId="0EF72933">
-            <wp:extent cx="5731510" cy="857885"/>
-            <wp:effectExtent l="0" t="0" r="2540" b="0"/>
-            <wp:docPr id="1001604368" name="Imagen 1"/>
+          <wp:inline distT="0" distB="0" distL="0" distR="0" wp14:anchorId="75BCF127" wp14:editId="57E23A9B">
+            <wp:extent cx="5731510" cy="1325245"/>
+            <wp:effectExtent l="0" t="0" r="2540" b="8255"/>
+            <wp:docPr id="1046618615" name="Imagen 1"/>
             <wp:cNvGraphicFramePr>
               <a:graphicFrameLocks xmlns:a="http://schemas.openxmlformats.org/drawingml/2006/main" noChangeAspect="1"/>
             </wp:cNvGraphicFramePr>
@@ -1616,7 +2210,7 @@
               <a:graphicData uri="http://schemas.openxmlformats.org/drawingml/2006/picture">
                 <pic:pic xmlns:pic="http://schemas.openxmlformats.org/drawingml/2006/picture">
                   <pic:nvPicPr>
-                    <pic:cNvPr id="1001604368" name="Imagen 1001604368"/>
+                    <pic:cNvPr id="1046618615" name="Imagen 1046618615"/>
                     <pic:cNvPicPr/>
                   </pic:nvPicPr>
                   <pic:blipFill>
@@ -1634,7 +2228,7 @@
                   <pic:spPr>
                     <a:xfrm>
                       <a:off x="0" y="0"/>
-                      <a:ext cx="5731510" cy="857885"/>
+                      <a:ext cx="5731510" cy="1325245"/>
                     </a:xfrm>
                     <a:prstGeom prst="rect">
                       <a:avLst/>
@@ -1670,7 +2264,21 @@
         <w:rPr>
           <w:color w:val="000000"/>
         </w:rPr>
-        <w:t>La tarea usa seis archivos de condiciones: tres de práctica y tres experimentales, uno por nivel. A diferencia de las tareas anteriores, el orden de los trials es crítico y no debe aleatorizarse.</w:t>
+        <w:t xml:space="preserve">La tarea usa seis archivos de condiciones: tres de práctica y tres experimentales, uno por nivel. A diferencia de las tareas anteriores, el orden de los </w:t>
+      </w:r>
+      <w:proofErr w:type="spellStart"/>
+      <w:r>
+        <w:rPr>
+          <w:color w:val="000000"/>
+        </w:rPr>
+        <w:t>trials</w:t>
+      </w:r>
+      <w:proofErr w:type="spellEnd"/>
+      <w:r>
+        <w:rPr>
+          <w:color w:val="000000"/>
+        </w:rPr>
+        <w:t xml:space="preserve"> es crítico y no debe aleatorizarse.</w:t>
       </w:r>
     </w:p>
     <w:p>
@@ -1783,6 +2391,7 @@
                 <w:sz w:val="22"/>
                 <w:szCs w:val="22"/>
               </w:rPr>
+              <w:lastRenderedPageBreak/>
               <w:t>Columna</w:t>
             </w:r>
           </w:p>
@@ -1844,9 +2453,11 @@
             </w:tcMar>
           </w:tcPr>
           <w:p>
+            <w:proofErr w:type="spellStart"/>
             <w:r>
               <w:t>id_p</w:t>
             </w:r>
+            <w:proofErr w:type="spellEnd"/>
           </w:p>
         </w:tc>
         <w:tc>
@@ -1892,13 +2503,13 @@
             </w:tcMar>
           </w:tcPr>
           <w:p>
-            <w:r>
-              <w:rPr>
-                <w:color w:val="000000"/>
-                <w:sz w:val="22"/>
-                <w:szCs w:val="22"/>
-              </w:rPr>
-              <w:lastRenderedPageBreak/>
+            <w:proofErr w:type="spellStart"/>
+            <w:r>
+              <w:rPr>
+                <w:color w:val="000000"/>
+                <w:sz w:val="22"/>
+                <w:szCs w:val="22"/>
+              </w:rPr>
               <w:t>letra</w:t>
             </w:r>
             <w:r>
@@ -1909,6 +2520,7 @@
               </w:rPr>
               <w:t>_p</w:t>
             </w:r>
+            <w:proofErr w:type="spellEnd"/>
           </w:p>
         </w:tc>
         <w:tc>
@@ -1954,14 +2566,25 @@
             </w:tcMar>
           </w:tcPr>
           <w:p>
-            <w:r>
-              <w:rPr>
-                <w:color w:val="000000"/>
-                <w:sz w:val="22"/>
-                <w:szCs w:val="22"/>
-              </w:rPr>
-              <w:t>es_target</w:t>
-            </w:r>
+            <w:proofErr w:type="spellStart"/>
+            <w:r>
+              <w:rPr>
+                <w:color w:val="000000"/>
+                <w:sz w:val="22"/>
+                <w:szCs w:val="22"/>
+              </w:rPr>
+              <w:t>es_</w:t>
+            </w:r>
+            <w:proofErr w:type="gramStart"/>
+            <w:r>
+              <w:rPr>
+                <w:color w:val="000000"/>
+                <w:sz w:val="22"/>
+                <w:szCs w:val="22"/>
+              </w:rPr>
+              <w:t>target</w:t>
+            </w:r>
+            <w:proofErr w:type="gramEnd"/>
             <w:r>
               <w:rPr>
                 <w:color w:val="000000"/>
@@ -1970,6 +2593,7 @@
               </w:rPr>
               <w:t>_p</w:t>
             </w:r>
+            <w:proofErr w:type="spellEnd"/>
           </w:p>
         </w:tc>
         <w:tc>
@@ -1991,7 +2615,23 @@
           </w:tcPr>
           <w:p>
             <w:r>
-              <w:t>Indica si el trial es target (1) o no-target (0) según el nivel N</w:t>
+              <w:t xml:space="preserve">Indica si el trial es </w:t>
+            </w:r>
+            <w:proofErr w:type="gramStart"/>
+            <w:r>
+              <w:t>target</w:t>
+            </w:r>
+            <w:proofErr w:type="gramEnd"/>
+            <w:r>
+              <w:t xml:space="preserve"> (1) o no-</w:t>
+            </w:r>
+            <w:proofErr w:type="gramStart"/>
+            <w:r>
+              <w:t>target</w:t>
+            </w:r>
+            <w:proofErr w:type="gramEnd"/>
+            <w:r>
+              <w:t xml:space="preserve"> (0) según el nivel N</w:t>
             </w:r>
           </w:p>
         </w:tc>
@@ -2015,6 +2655,7 @@
             </w:tcMar>
           </w:tcPr>
           <w:p>
+            <w:proofErr w:type="spellStart"/>
             <w:r>
               <w:rPr>
                 <w:color w:val="000000"/>
@@ -2023,6 +2664,7 @@
               </w:rPr>
               <w:t>tecla_correcta_p</w:t>
             </w:r>
+            <w:proofErr w:type="spellEnd"/>
           </w:p>
         </w:tc>
         <w:tc>
@@ -2044,7 +2686,23 @@
           </w:tcPr>
           <w:p>
             <w:r>
-              <w:t>Tecla válida para ese trial (A si es target, L si es no-target)</w:t>
+              <w:t xml:space="preserve">Tecla válida para ese trial (A si es </w:t>
+            </w:r>
+            <w:proofErr w:type="gramStart"/>
+            <w:r>
+              <w:t>target</w:t>
+            </w:r>
+            <w:proofErr w:type="gramEnd"/>
+            <w:r>
+              <w:t>, L si es no-</w:t>
+            </w:r>
+            <w:proofErr w:type="gramStart"/>
+            <w:r>
+              <w:t>target</w:t>
+            </w:r>
+            <w:proofErr w:type="gramEnd"/>
+            <w:r>
+              <w:t>)</w:t>
             </w:r>
           </w:p>
         </w:tc>
@@ -2081,7 +2739,61 @@
           <w:sz w:val="20"/>
           <w:szCs w:val="20"/>
         </w:rPr>
-        <w:t xml:space="preserve"> El componente Text debe tener: Text = $letra_p | Set every repeat activado.</w:t>
+        <w:t xml:space="preserve"> El componente Text debe tener: Text = $</w:t>
+      </w:r>
+      <w:proofErr w:type="spellStart"/>
+      <w:r>
+        <w:rPr>
+          <w:color w:val="000000"/>
+          <w:sz w:val="20"/>
+          <w:szCs w:val="20"/>
+        </w:rPr>
+        <w:t>letra_p</w:t>
+      </w:r>
+      <w:proofErr w:type="spellEnd"/>
+      <w:r>
+        <w:rPr>
+          <w:color w:val="000000"/>
+          <w:sz w:val="20"/>
+          <w:szCs w:val="20"/>
+        </w:rPr>
+        <w:t xml:space="preserve"> | Set </w:t>
+      </w:r>
+      <w:proofErr w:type="spellStart"/>
+      <w:r>
+        <w:rPr>
+          <w:color w:val="000000"/>
+          <w:sz w:val="20"/>
+          <w:szCs w:val="20"/>
+        </w:rPr>
+        <w:t>every</w:t>
+      </w:r>
+      <w:proofErr w:type="spellEnd"/>
+      <w:r>
+        <w:rPr>
+          <w:color w:val="000000"/>
+          <w:sz w:val="20"/>
+          <w:szCs w:val="20"/>
+        </w:rPr>
+        <w:t xml:space="preserve"> </w:t>
+      </w:r>
+      <w:proofErr w:type="spellStart"/>
+      <w:r>
+        <w:rPr>
+          <w:color w:val="000000"/>
+          <w:sz w:val="20"/>
+          <w:szCs w:val="20"/>
+        </w:rPr>
+        <w:t>repeat</w:t>
+      </w:r>
+      <w:proofErr w:type="spellEnd"/>
+      <w:r>
+        <w:rPr>
+          <w:color w:val="000000"/>
+          <w:sz w:val="20"/>
+          <w:szCs w:val="20"/>
+        </w:rPr>
+        <w:t xml:space="preserve"> activado.</w:t>
       </w:r>
     </w:p>
     <w:p>
@@ -2361,14 +3073,26 @@
             </w:tcMar>
           </w:tcPr>
           <w:p>
-            <w:r>
-              <w:rPr>
-                <w:color w:val="000000"/>
-                <w:sz w:val="22"/>
-                <w:szCs w:val="22"/>
-              </w:rPr>
-              <w:t>es_target</w:t>
-            </w:r>
+            <w:proofErr w:type="spellStart"/>
+            <w:r>
+              <w:rPr>
+                <w:color w:val="000000"/>
+                <w:sz w:val="22"/>
+                <w:szCs w:val="22"/>
+              </w:rPr>
+              <w:t>es_</w:t>
+            </w:r>
+            <w:proofErr w:type="gramStart"/>
+            <w:r>
+              <w:rPr>
+                <w:color w:val="000000"/>
+                <w:sz w:val="22"/>
+                <w:szCs w:val="22"/>
+              </w:rPr>
+              <w:t>target</w:t>
+            </w:r>
+            <w:proofErr w:type="spellEnd"/>
+            <w:proofErr w:type="gramEnd"/>
           </w:p>
         </w:tc>
         <w:tc>
@@ -2390,7 +3114,23 @@
           </w:tcPr>
           <w:p>
             <w:r>
-              <w:t>Indica si el trial es target (1) o no-target (0) según el nivel N</w:t>
+              <w:t xml:space="preserve">Indica si el trial es </w:t>
+            </w:r>
+            <w:proofErr w:type="gramStart"/>
+            <w:r>
+              <w:t>target</w:t>
+            </w:r>
+            <w:proofErr w:type="gramEnd"/>
+            <w:r>
+              <w:t xml:space="preserve"> (1) o no-</w:t>
+            </w:r>
+            <w:proofErr w:type="gramStart"/>
+            <w:r>
+              <w:t>target</w:t>
+            </w:r>
+            <w:proofErr w:type="gramEnd"/>
+            <w:r>
+              <w:t xml:space="preserve"> (0) según el nivel N</w:t>
             </w:r>
           </w:p>
         </w:tc>
@@ -2414,6 +3154,7 @@
             </w:tcMar>
           </w:tcPr>
           <w:p>
+            <w:proofErr w:type="spellStart"/>
             <w:r>
               <w:rPr>
                 <w:color w:val="000000"/>
@@ -2422,6 +3163,7 @@
               </w:rPr>
               <w:t>tecla_correcta</w:t>
             </w:r>
+            <w:proofErr w:type="spellEnd"/>
           </w:p>
         </w:tc>
         <w:tc>
@@ -2443,7 +3185,23 @@
           </w:tcPr>
           <w:p>
             <w:r>
-              <w:t>Tecla válida para ese trial (A si es target, L si es no-target)</w:t>
+              <w:t xml:space="preserve">Tecla válida para ese trial (A si es </w:t>
+            </w:r>
+            <w:proofErr w:type="gramStart"/>
+            <w:r>
+              <w:t>target</w:t>
+            </w:r>
+            <w:proofErr w:type="gramEnd"/>
+            <w:r>
+              <w:t>, L si es no-</w:t>
+            </w:r>
+            <w:proofErr w:type="gramStart"/>
+            <w:r>
+              <w:t>target</w:t>
+            </w:r>
+            <w:proofErr w:type="gramEnd"/>
+            <w:r>
+              <w:t>)</w:t>
             </w:r>
           </w:p>
         </w:tc>
@@ -2470,7 +3228,43 @@
           <w:sz w:val="20"/>
           <w:szCs w:val="20"/>
         </w:rPr>
-        <w:t>El componente Text debe tener: Text = $letra | Set every repeat activado.</w:t>
+        <w:t xml:space="preserve">El componente Text debe tener: Text = $letra | Set </w:t>
+      </w:r>
+      <w:proofErr w:type="spellStart"/>
+      <w:r>
+        <w:rPr>
+          <w:color w:val="000000"/>
+          <w:sz w:val="20"/>
+          <w:szCs w:val="20"/>
+        </w:rPr>
+        <w:t>every</w:t>
+      </w:r>
+      <w:proofErr w:type="spellEnd"/>
+      <w:r>
+        <w:rPr>
+          <w:color w:val="000000"/>
+          <w:sz w:val="20"/>
+          <w:szCs w:val="20"/>
+        </w:rPr>
+        <w:t xml:space="preserve"> </w:t>
+      </w:r>
+      <w:proofErr w:type="spellStart"/>
+      <w:r>
+        <w:rPr>
+          <w:color w:val="000000"/>
+          <w:sz w:val="20"/>
+          <w:szCs w:val="20"/>
+        </w:rPr>
+        <w:t>repeat</w:t>
+      </w:r>
+      <w:proofErr w:type="spellEnd"/>
+      <w:r>
+        <w:rPr>
+          <w:color w:val="000000"/>
+          <w:sz w:val="20"/>
+          <w:szCs w:val="20"/>
+        </w:rPr>
+        <w:t xml:space="preserve"> activado.</w:t>
       </w:r>
     </w:p>
     <w:tbl>
@@ -2532,7 +3326,89 @@
                 <w:sz w:val="22"/>
                 <w:szCs w:val="22"/>
               </w:rPr>
-              <w:t>Los primeros n trials de cada bloque tienen es_target = 0 porque no existe referencia n posiciones atrás. Para 1-back: primer trial. Para 2-back: primeros 2 trials. Para 3-back: primeros 3 trials.</w:t>
+              <w:t xml:space="preserve">Los primeros n </w:t>
+            </w:r>
+            <w:proofErr w:type="spellStart"/>
+            <w:r>
+              <w:rPr>
+                <w:color w:val="000000"/>
+                <w:sz w:val="22"/>
+                <w:szCs w:val="22"/>
+              </w:rPr>
+              <w:t>trials</w:t>
+            </w:r>
+            <w:proofErr w:type="spellEnd"/>
+            <w:r>
+              <w:rPr>
+                <w:color w:val="000000"/>
+                <w:sz w:val="22"/>
+                <w:szCs w:val="22"/>
+              </w:rPr>
+              <w:t xml:space="preserve"> de cada bloque tienen </w:t>
+            </w:r>
+            <w:proofErr w:type="spellStart"/>
+            <w:r>
+              <w:rPr>
+                <w:color w:val="000000"/>
+                <w:sz w:val="22"/>
+                <w:szCs w:val="22"/>
+              </w:rPr>
+              <w:t>es_</w:t>
+            </w:r>
+            <w:proofErr w:type="gramStart"/>
+            <w:r>
+              <w:rPr>
+                <w:color w:val="000000"/>
+                <w:sz w:val="22"/>
+                <w:szCs w:val="22"/>
+              </w:rPr>
+              <w:t>target</w:t>
+            </w:r>
+            <w:proofErr w:type="spellEnd"/>
+            <w:proofErr w:type="gramEnd"/>
+            <w:r>
+              <w:rPr>
+                <w:color w:val="000000"/>
+                <w:sz w:val="22"/>
+                <w:szCs w:val="22"/>
+              </w:rPr>
+              <w:t xml:space="preserve"> = 0 porque no existe referencia n posiciones atrás. Para 1-back: primer trial. Para 2-back: primeros 2 </w:t>
+            </w:r>
+            <w:proofErr w:type="spellStart"/>
+            <w:r>
+              <w:rPr>
+                <w:color w:val="000000"/>
+                <w:sz w:val="22"/>
+                <w:szCs w:val="22"/>
+              </w:rPr>
+              <w:t>trials</w:t>
+            </w:r>
+            <w:proofErr w:type="spellEnd"/>
+            <w:r>
+              <w:rPr>
+                <w:color w:val="000000"/>
+                <w:sz w:val="22"/>
+                <w:szCs w:val="22"/>
+              </w:rPr>
+              <w:t xml:space="preserve">. Para 3-back: primeros 3 </w:t>
+            </w:r>
+            <w:proofErr w:type="spellStart"/>
+            <w:r>
+              <w:rPr>
+                <w:color w:val="000000"/>
+                <w:sz w:val="22"/>
+                <w:szCs w:val="22"/>
+              </w:rPr>
+              <w:t>trials</w:t>
+            </w:r>
+            <w:proofErr w:type="spellEnd"/>
+            <w:r>
+              <w:rPr>
+                <w:color w:val="000000"/>
+                <w:sz w:val="22"/>
+                <w:szCs w:val="22"/>
+              </w:rPr>
+              <w:t>.</w:t>
             </w:r>
           </w:p>
         </w:tc>
@@ -2561,7 +3437,35 @@
         <w:rPr>
           <w:color w:val="000000"/>
         </w:rPr>
-        <w:t>Las instrucciones de cada pantalla están disponibles en el archivo instrucciones_nback.docx. Existen dos formas de mostrarlas en PsychoPy Builder:</w:t>
+        <w:t xml:space="preserve">Las instrucciones de cada pantalla están disponibles en el archivo instrucciones_nback.docx. Existen dos formas de mostrarlas en </w:t>
+      </w:r>
+      <w:proofErr w:type="spellStart"/>
+      <w:r>
+        <w:rPr>
+          <w:color w:val="000000"/>
+        </w:rPr>
+        <w:t>PsychoPy</w:t>
+      </w:r>
+      <w:proofErr w:type="spellEnd"/>
+      <w:r>
+        <w:rPr>
+          <w:color w:val="000000"/>
+        </w:rPr>
+        <w:t xml:space="preserve"> </w:t>
+      </w:r>
+      <w:proofErr w:type="spellStart"/>
+      <w:r>
+        <w:rPr>
+          <w:color w:val="000000"/>
+        </w:rPr>
+        <w:t>Builder</w:t>
+      </w:r>
+      <w:proofErr w:type="spellEnd"/>
+      <w:r>
+        <w:rPr>
+          <w:color w:val="000000"/>
+        </w:rPr>
+        <w:t>:</w:t>
       </w:r>
     </w:p>
     <w:p>
@@ -2581,7 +3485,21 @@
           <w:color w:val="000000"/>
         </w:rPr>
         <w:tab/>
-        <w:t>Componente Text: copiar el texto directamente en un componente Text de PsychoPy. Es la opción más rápida y no requiere archivos adicionales.</w:t>
+        <w:t xml:space="preserve">Componente Text: copiar el texto directamente en un componente Text de </w:t>
+      </w:r>
+      <w:proofErr w:type="spellStart"/>
+      <w:r>
+        <w:rPr>
+          <w:color w:val="000000"/>
+        </w:rPr>
+        <w:t>PsychoPy</w:t>
+      </w:r>
+      <w:proofErr w:type="spellEnd"/>
+      <w:r>
+        <w:rPr>
+          <w:color w:val="000000"/>
+        </w:rPr>
+        <w:t>. Es la opción más rápida y no requiere archivos adicionales.</w:t>
       </w:r>
     </w:p>
     <w:p>
@@ -2601,7 +3519,63 @@
           <w:color w:val="000000"/>
         </w:rPr>
         <w:tab/>
-        <w:t>Componente Image con imagen de Canva: preparar una imagen .png en Canva con diseño visual (colores, ejemplos de secuencia) y cargarla con un componente Image. Permite mayor claridad visual para el participante.</w:t>
+        <w:t xml:space="preserve">Componente </w:t>
+      </w:r>
+      <w:proofErr w:type="spellStart"/>
+      <w:r>
+        <w:rPr>
+          <w:color w:val="000000"/>
+        </w:rPr>
+        <w:t>Image</w:t>
+      </w:r>
+      <w:proofErr w:type="spellEnd"/>
+      <w:r>
+        <w:rPr>
+          <w:color w:val="000000"/>
+        </w:rPr>
+        <w:t xml:space="preserve"> con imagen de </w:t>
+      </w:r>
+      <w:proofErr w:type="spellStart"/>
+      <w:r>
+        <w:rPr>
+          <w:color w:val="000000"/>
+        </w:rPr>
+        <w:t>Canva</w:t>
+      </w:r>
+      <w:proofErr w:type="spellEnd"/>
+      <w:r>
+        <w:rPr>
+          <w:color w:val="000000"/>
+        </w:rPr>
+        <w:t xml:space="preserve">: preparar una imagen .png en </w:t>
+      </w:r>
+      <w:proofErr w:type="spellStart"/>
+      <w:r>
+        <w:rPr>
+          <w:color w:val="000000"/>
+        </w:rPr>
+        <w:t>Canva</w:t>
+      </w:r>
+      <w:proofErr w:type="spellEnd"/>
+      <w:r>
+        <w:rPr>
+          <w:color w:val="000000"/>
+        </w:rPr>
+        <w:t xml:space="preserve"> con diseño visual (colores, ejemplos de secuencia) y cargarla con un componente </w:t>
+      </w:r>
+      <w:proofErr w:type="spellStart"/>
+      <w:r>
+        <w:rPr>
+          <w:color w:val="000000"/>
+        </w:rPr>
+        <w:t>Image</w:t>
+      </w:r>
+      <w:proofErr w:type="spellEnd"/>
+      <w:r>
+        <w:rPr>
+          <w:color w:val="000000"/>
+        </w:rPr>
+        <w:t>. Permite mayor claridad visual para el participante.</w:t>
       </w:r>
     </w:p>
     <w:p>
@@ -2669,7 +3643,79 @@
                 <w:sz w:val="22"/>
                 <w:szCs w:val="22"/>
               </w:rPr>
-              <w:t>Si se usa la opción de imagen Canva, preparar una imagen distinta por nivel (NB1, NB2, NB3) indicando claramente el valor de N y el ejemplo de secuencia correspondiente. Si se usa componente Text, asegurarse de configurar Set every repeat desactivado para que el texto no cambie entre trials.</w:t>
+              <w:t xml:space="preserve">Si se usa la opción de imagen </w:t>
+            </w:r>
+            <w:proofErr w:type="spellStart"/>
+            <w:r>
+              <w:rPr>
+                <w:color w:val="000000"/>
+                <w:sz w:val="22"/>
+                <w:szCs w:val="22"/>
+              </w:rPr>
+              <w:t>Canva</w:t>
+            </w:r>
+            <w:proofErr w:type="spellEnd"/>
+            <w:r>
+              <w:rPr>
+                <w:color w:val="000000"/>
+                <w:sz w:val="22"/>
+                <w:szCs w:val="22"/>
+              </w:rPr>
+              <w:t xml:space="preserve">, preparar una imagen distinta por nivel (NB1, NB2, NB3) indicando claramente el valor de N y el ejemplo de secuencia correspondiente. Si se usa componente Text, asegurarse de configurar Set </w:t>
+            </w:r>
+            <w:proofErr w:type="spellStart"/>
+            <w:r>
+              <w:rPr>
+                <w:color w:val="000000"/>
+                <w:sz w:val="22"/>
+                <w:szCs w:val="22"/>
+              </w:rPr>
+              <w:t>every</w:t>
+            </w:r>
+            <w:proofErr w:type="spellEnd"/>
+            <w:r>
+              <w:rPr>
+                <w:color w:val="000000"/>
+                <w:sz w:val="22"/>
+                <w:szCs w:val="22"/>
+              </w:rPr>
+              <w:t xml:space="preserve"> </w:t>
+            </w:r>
+            <w:proofErr w:type="spellStart"/>
+            <w:r>
+              <w:rPr>
+                <w:color w:val="000000"/>
+                <w:sz w:val="22"/>
+                <w:szCs w:val="22"/>
+              </w:rPr>
+              <w:t>repeat</w:t>
+            </w:r>
+            <w:proofErr w:type="spellEnd"/>
+            <w:r>
+              <w:rPr>
+                <w:color w:val="000000"/>
+                <w:sz w:val="22"/>
+                <w:szCs w:val="22"/>
+              </w:rPr>
+              <w:t xml:space="preserve"> desactivado para que el texto no cambie entre </w:t>
+            </w:r>
+            <w:proofErr w:type="spellStart"/>
+            <w:r>
+              <w:rPr>
+                <w:color w:val="000000"/>
+                <w:sz w:val="22"/>
+                <w:szCs w:val="22"/>
+              </w:rPr>
+              <w:t>trials</w:t>
+            </w:r>
+            <w:proofErr w:type="spellEnd"/>
+            <w:r>
+              <w:rPr>
+                <w:color w:val="000000"/>
+                <w:sz w:val="22"/>
+                <w:szCs w:val="22"/>
+              </w:rPr>
+              <w:t>.</w:t>
             </w:r>
           </w:p>
         </w:tc>
@@ -2698,7 +3744,22 @@
         <w:rPr>
           <w:color w:val="000000"/>
         </w:rPr>
-        <w:t>Una vez completada la tarea, el CSV generado por PsychoPy puede procesarse en la aplicación web del curso:</w:t>
+        <w:lastRenderedPageBreak/>
+        <w:t xml:space="preserve">Una vez completada la tarea, el CSV generado por </w:t>
+      </w:r>
+      <w:proofErr w:type="spellStart"/>
+      <w:r>
+        <w:rPr>
+          <w:color w:val="000000"/>
+        </w:rPr>
+        <w:t>PsychoPy</w:t>
+      </w:r>
+      <w:proofErr w:type="spellEnd"/>
+      <w:r>
+        <w:rPr>
+          <w:color w:val="000000"/>
+        </w:rPr>
+        <w:t xml:space="preserve"> puede procesarse en la aplicación web del curso:</w:t>
       </w:r>
     </w:p>
     <w:p>
@@ -2772,7 +3833,21 @@
           <w:color w:val="000000"/>
         </w:rPr>
         <w:tab/>
-        <w:t>Arrastrar el archivo .csv al área de carga.</w:t>
+        <w:t>Arrastrar el archivo .</w:t>
+      </w:r>
+      <w:proofErr w:type="spellStart"/>
+      <w:r>
+        <w:rPr>
+          <w:color w:val="000000"/>
+        </w:rPr>
+        <w:t>csv</w:t>
+      </w:r>
+      <w:proofErr w:type="spellEnd"/>
+      <w:r>
+        <w:rPr>
+          <w:color w:val="000000"/>
+        </w:rPr>
+        <w:t xml:space="preserve"> al área de carga.</w:t>
       </w:r>
     </w:p>
     <w:p>
@@ -2878,7 +3953,61 @@
                 <w:sz w:val="22"/>
                 <w:szCs w:val="22"/>
               </w:rPr>
-              <w:t>La aplicación procesa únicamente los trials de la fase experimental. La fase de práctica no se incluye en el análisis. Los resultados se muestran separados por nivel y por tipo de trial (target vs non-target).</w:t>
+              <w:t xml:space="preserve">La aplicación procesa únicamente los </w:t>
+            </w:r>
+            <w:proofErr w:type="spellStart"/>
+            <w:r>
+              <w:rPr>
+                <w:color w:val="000000"/>
+                <w:sz w:val="22"/>
+                <w:szCs w:val="22"/>
+              </w:rPr>
+              <w:t>trials</w:t>
+            </w:r>
+            <w:proofErr w:type="spellEnd"/>
+            <w:r>
+              <w:rPr>
+                <w:color w:val="000000"/>
+                <w:sz w:val="22"/>
+                <w:szCs w:val="22"/>
+              </w:rPr>
+              <w:t xml:space="preserve"> de la fase experimental. La fase de práctica no se incluye en el análisis. Los resultados se muestran separados por nivel y por tipo de trial (</w:t>
+            </w:r>
+            <w:proofErr w:type="gramStart"/>
+            <w:r>
+              <w:rPr>
+                <w:color w:val="000000"/>
+                <w:sz w:val="22"/>
+                <w:szCs w:val="22"/>
+              </w:rPr>
+              <w:t>target</w:t>
+            </w:r>
+            <w:proofErr w:type="gramEnd"/>
+            <w:r>
+              <w:rPr>
+                <w:color w:val="000000"/>
+                <w:sz w:val="22"/>
+                <w:szCs w:val="22"/>
+              </w:rPr>
+              <w:t xml:space="preserve"> vs non-</w:t>
+            </w:r>
+            <w:proofErr w:type="gramStart"/>
+            <w:r>
+              <w:rPr>
+                <w:color w:val="000000"/>
+                <w:sz w:val="22"/>
+                <w:szCs w:val="22"/>
+              </w:rPr>
+              <w:t>target</w:t>
+            </w:r>
+            <w:proofErr w:type="gramEnd"/>
+            <w:r>
+              <w:rPr>
+                <w:color w:val="000000"/>
+                <w:sz w:val="22"/>
+                <w:szCs w:val="22"/>
+              </w:rPr>
+              <w:t>).</w:t>
             </w:r>
           </w:p>
         </w:tc>
@@ -2892,6 +4021,7 @@
           <w:lang w:val="en-US"/>
         </w:rPr>
       </w:pPr>
+      <w:proofErr w:type="spellStart"/>
       <w:r>
         <w:rPr>
           <w:b/>
@@ -2901,6 +4031,7 @@
         </w:rPr>
         <w:t>Referencias</w:t>
       </w:r>
+      <w:proofErr w:type="spellEnd"/>
     </w:p>
     <w:p>
       <w:pPr>

</xml_diff>